<commit_message>
Rewrite stats sheet to exact scaffold format - Influences/Processes/Strategies with practice essay stats
</commit_message>
<xml_diff>
--- a/Marketing/McDonalds_Marketing_Stats_Sheet.docx
+++ b/Marketing/McDonalds_Marketing_Stats_Sheet.docx
@@ -4,1458 +4,151 @@
   <w:body>
     <w:p>
       <w:pPr>
-        <w:spacing w:before="0" w:after="60" w:line="276" w:lineRule="auto"/>
+        <w:pStyle w:val="Heading1"/>
         <w:jc w:val="center"/>
       </w:pPr>
       <w:r>
-        <w:rPr>
-          <w:rFonts w:ascii="Arial" w:hAnsi="Arial" w:cs="Arial"/>
-          <w:b/>
-          <w:sz w:val="22"/>
-        </w:rPr>
-        <w:t>McDONALD'S MARKETING STATS SHEET</w:t>
+        <w:t>McDonald's Case Study Info</w:t>
+      </w:r>
+    </w:p>
+    <w:p/>
+    <w:p>
+      <w:pPr>
+        <w:pStyle w:val="Heading2"/>
+      </w:pPr>
+      <w:r>
+        <w:t>Influences</w:t>
+      </w:r>
+    </w:p>
+    <w:p>
+      <w:r>
+        <w:t>Consumer Law (CCA 2010) — McDonald's must comply with the Competition and Consumer Act 2010, enforced by the ACCC. This includes no misleading advertising, no bait and switch, implied conditions (fitness for purpose, quality), and mandatory refunds for faulty products. McDonald's Australia revenue $25.9B (2024) shows compliance builds consumer trust and sustains high sales.</w:t>
+      </w:r>
+    </w:p>
+    <w:p>
+      <w:r>
+        <w:t>Ethical Influences — McDonald's faces ethical scrutiny over health impacts of fast food. The Responsible Children's Marketing Initiative and Quick Service Restaurant Code restrict advertising to children unless products meet nutritional guidelines. This self-regulation protects brand reputation — McDonald's serves 69 million customers daily worldwide, partly because consumers trust the brand acts responsibly.</w:t>
+      </w:r>
+    </w:p>
+    <w:p>
+      <w:r>
+        <w:t>Government Influences — Fiscal policy (taxation and government spending) affects consumer disposable income. When interest rates are low, consumers have more spending money and are more likely to eat out. McDonald's adjusts pricing strategies during economic downturns — the Looser Change Menu (items from $1–$3) was introduced to maintain sales when consumers had less disposable income during the GFC.</w:t>
+      </w:r>
+    </w:p>
+    <w:p>
+      <w:r>
+        <w:t>Customer Choice — Psychological: Perception drives choice — McDonald's branding (golden arches, red/yellow colours) creates instant recognition. Motives: convenience and value-for-money appeal to time-poor consumers. Learning: consistent quality leads to repeat purchases and brand loyalty — 150 million+ loyalty members globally show this works.</w:t>
+      </w:r>
+    </w:p>
+    <w:p>
+      <w:r>
+        <w:t>Customer Choice — Sociocultural: Family influence — McDonald's Happy Meals target families with children. Culture: menu adapted for local tastes (McSpicy Paneer in India, Teriyaki Burger in Japan). Social class: mass market positioning makes it accessible across all income levels.</w:t>
+      </w:r>
+    </w:p>
+    <w:p>
+      <w:r>
+        <w:t>Customer Choice — Economic: During boom periods, consumers spend more on dining out. During recession, consumers trade down to cheaper options — McDonald's value menu ($1–$3 items) captures price-sensitive customers. RBA interest rate decisions directly affect how much consumers spend on fast food.</w:t>
       </w:r>
     </w:p>
     <w:p>
       <w:pPr>
-        <w:spacing w:before="80" w:after="20" w:line="276" w:lineRule="auto"/>
+        <w:pStyle w:val="Heading2"/>
       </w:pPr>
       <w:r>
-        <w:rPr>
-          <w:rFonts w:ascii="Arial" w:hAnsi="Arial" w:cs="Arial"/>
-          <w:b/>
-          <w:sz w:val="20"/>
-        </w:rPr>
-        <w:t>McDonald's</w:t>
+        <w:t>Processes</w:t>
+      </w:r>
+    </w:p>
+    <w:p>
+      <w:r>
+        <w:t>Marketing Objectives — McDonald's key objectives: increase market share (23.2% Australian fast food market, 2024), maximise customer service (150 million+ loyalty members), and expand product mix (plant-based options, McCafé range).</w:t>
+      </w:r>
+    </w:p>
+    <w:p>
+      <w:r>
+        <w:t>Market Research — McDonald's uses primary research (customer satisfaction surveys, focus groups on new menu items) and secondary research (industry reports, ABS data). Research identified demand for healthier options → led to salads, grilled chicken, and fruit alternatives. Also identified demand for convenience → led to self-order kiosks and delivery partnerships.</w:t>
+      </w:r>
+    </w:p>
+    <w:p>
+      <w:r>
+        <w:t>SWOT Analysis — Strengths: global brand recognition, 40,000+ restaurants in 100+ countries, $25.9B revenue. Weaknesses: health perceptions, franchise complexity. Opportunities: plant-based market growth, digital ordering expansion. Threats: rising ingredient costs, competition from Hungry Jack's and Subway.</w:t>
+      </w:r>
+    </w:p>
+    <w:p>
+      <w:r>
+        <w:t>Target Market — Primary: families with children (Happy Meals), young adults (value menu). Secondary: health-conscious consumers (salads, grilled options), coffee drinkers (McCafé competing with Starbucks).</w:t>
+      </w:r>
+    </w:p>
+    <w:p>
+      <w:r>
+        <w:t>Product Life Cycle — McDonald's core products (Big Mac, fries) are in the maturity stage — heavy competition, focus on differentiation and loyalty programs. New products like the McPlant are in the growth stage — increasing distribution and promotional spending.</w:t>
+      </w:r>
+    </w:p>
+    <w:p>
+      <w:r>
+        <w:t>Monitoring &amp; Controlling — McDonald's tracks sales analysis (daily/weekly sales per restaurant), market share analysis (23.2% vs KFC 16.5%), and profitability analysis (menu item margins). Financial forecasts compare projected costs (ingredients, labour, rent) against revenue to allocate resources.</w:t>
       </w:r>
     </w:p>
     <w:p>
       <w:pPr>
-        <w:spacing w:before="0" w:after="0" w:line="276" w:lineRule="auto"/>
-        <w:ind w:left="283"/>
+        <w:pStyle w:val="Heading2"/>
       </w:pPr>
       <w:r>
-        <w:rPr>
-          <w:rFonts w:ascii="Arial" w:hAnsi="Arial" w:cs="Arial"/>
-          <w:b/>
-          <w:sz w:val="18"/>
-        </w:rPr>
-        <w:t xml:space="preserve">Revenue (2024) — </w:t>
-      </w:r>
-      <w:r>
-        <w:rPr>
-          <w:rFonts w:ascii="Arial" w:hAnsi="Arial" w:cs="Arial"/>
-          <w:b w:val="0"/>
-          <w:sz w:val="18"/>
-        </w:rPr>
-        <w:t>$25.9B USD (+2% from 2023)</w:t>
+        <w:t>Strategies</w:t>
       </w:r>
     </w:p>
     <w:p>
-      <w:pPr>
-        <w:spacing w:before="0" w:after="0" w:line="276" w:lineRule="auto"/>
-        <w:ind w:left="283"/>
-      </w:pPr>
       <w:r>
-        <w:rPr>
-          <w:rFonts w:ascii="Arial" w:hAnsi="Arial" w:cs="Arial"/>
-          <w:b/>
-          <w:sz w:val="18"/>
-        </w:rPr>
-        <w:t xml:space="preserve">Revenue (2025) — </w:t>
-      </w:r>
-      <w:r>
-        <w:rPr>
-          <w:rFonts w:ascii="Arial" w:hAnsi="Arial" w:cs="Arial"/>
-          <w:b w:val="0"/>
-          <w:sz w:val="18"/>
-        </w:rPr>
-        <w:t>$26.9B USD (+3.7% from 2024)</w:t>
+        <w:t>Product Strategies — McDonald's uses the total product concept: tangible (burger, fries, drink) + intangible (brand reputation, fast service, consistency). Product mix includes 100+ menu items across burgers, chicken, salads, McCafé, desserts, and Happy Meals. Branding: golden arches logo is one of the most recognised globally. Packaging: consistent red/yellow branding across all restaurants.</w:t>
       </w:r>
     </w:p>
     <w:p>
-      <w:pPr>
-        <w:spacing w:before="0" w:after="0" w:line="276" w:lineRule="auto"/>
-        <w:ind w:left="283"/>
-      </w:pPr>
       <w:r>
-        <w:rPr>
-          <w:rFonts w:ascii="Arial" w:hAnsi="Arial" w:cs="Arial"/>
-          <w:b/>
-          <w:sz w:val="18"/>
-        </w:rPr>
-        <w:t xml:space="preserve">Net Income (2024) — </w:t>
-      </w:r>
-      <w:r>
-        <w:rPr>
-          <w:rFonts w:ascii="Arial" w:hAnsi="Arial" w:cs="Arial"/>
-          <w:b w:val="0"/>
-          <w:sz w:val="18"/>
-        </w:rPr>
-        <w:t>$8.22B USD</w:t>
+        <w:t>Pricing Strategies — McDonald's uses a mix of pricing strategies such as:</w:t>
       </w:r>
     </w:p>
     <w:p>
-      <w:pPr>
-        <w:spacing w:before="0" w:after="0" w:line="276" w:lineRule="auto"/>
-        <w:ind w:left="283"/>
-      </w:pPr>
       <w:r>
-        <w:rPr>
-          <w:rFonts w:ascii="Arial" w:hAnsi="Arial" w:cs="Arial"/>
-          <w:b/>
-          <w:sz w:val="18"/>
-        </w:rPr>
-        <w:t xml:space="preserve">Net Income (2025) — </w:t>
-      </w:r>
-      <w:r>
-        <w:rPr>
-          <w:rFonts w:ascii="Arial" w:hAnsi="Arial" w:cs="Arial"/>
-          <w:b w:val="0"/>
-          <w:sz w:val="18"/>
-        </w:rPr>
-        <w:t>$8.56B USD (+4.1%)</w:t>
+        <w:t>Loss Leaders — Loose Change Menu items ($1–$3): Cheeseburgers, Frozen Cokes, Soft Serve ice creams attract customers who then purchase full-price meals.</w:t>
       </w:r>
     </w:p>
     <w:p>
-      <w:pPr>
-        <w:spacing w:before="0" w:after="0" w:line="276" w:lineRule="auto"/>
-        <w:ind w:left="283"/>
-      </w:pPr>
       <w:r>
-        <w:rPr>
-          <w:rFonts w:ascii="Arial" w:hAnsi="Arial" w:cs="Arial"/>
-          <w:b/>
-          <w:sz w:val="18"/>
-        </w:rPr>
-        <w:t xml:space="preserve">Global Systemwide Sales (2025) — </w:t>
-      </w:r>
-      <w:r>
-        <w:rPr>
-          <w:rFonts w:ascii="Arial" w:hAnsi="Arial" w:cs="Arial"/>
-          <w:b w:val="0"/>
-          <w:sz w:val="18"/>
-        </w:rPr>
-        <w:t>$139B USD (+7% YoY)</w:t>
+        <w:t>Price Points — Value meals priced at small ($5.90), medium ($7.90), large ($9.90) — consumers trade up to larger sizes.</w:t>
       </w:r>
     </w:p>
     <w:p>
-      <w:pPr>
-        <w:spacing w:before="0" w:after="0" w:line="276" w:lineRule="auto"/>
-        <w:ind w:left="283"/>
-      </w:pPr>
       <w:r>
-        <w:rPr>
-          <w:rFonts w:ascii="Arial" w:hAnsi="Arial" w:cs="Arial"/>
-          <w:b/>
-          <w:sz w:val="18"/>
-        </w:rPr>
-        <w:t xml:space="preserve">Global Comparable Sales (2025) — </w:t>
-      </w:r>
-      <w:r>
-        <w:rPr>
-          <w:rFonts w:ascii="Arial" w:hAnsi="Arial" w:cs="Arial"/>
-          <w:b w:val="0"/>
-          <w:sz w:val="18"/>
-        </w:rPr>
-        <w:t>+3.1%</w:t>
+        <w:t>Prestige Pricing — McCafé coffees priced above takeaway coffee competitors to signal quality ($4.50–$6.50).</w:t>
       </w:r>
     </w:p>
     <w:p>
-      <w:pPr>
-        <w:spacing w:before="0" w:after="0" w:line="276" w:lineRule="auto"/>
-        <w:ind w:left="283"/>
-      </w:pPr>
       <w:r>
-        <w:rPr>
-          <w:rFonts w:ascii="Arial" w:hAnsi="Arial" w:cs="Arial"/>
-          <w:b/>
-          <w:sz w:val="18"/>
-        </w:rPr>
-        <w:t xml:space="preserve">Global Restaurants (end 2024) — </w:t>
-      </w:r>
-      <w:r>
-        <w:rPr>
-          <w:rFonts w:ascii="Arial" w:hAnsi="Arial" w:cs="Arial"/>
-          <w:b w:val="0"/>
-          <w:sz w:val="18"/>
-        </w:rPr>
-        <w:t>43,477</w:t>
+        <w:t>Penetration Pricing — McDelivery launched at competitive prices to gain market share in the delivery segment.</w:t>
       </w:r>
     </w:p>
     <w:p>
-      <w:pPr>
-        <w:spacing w:before="0" w:after="0" w:line="276" w:lineRule="auto"/>
-        <w:ind w:left="283"/>
-      </w:pPr>
       <w:r>
-        <w:rPr>
-          <w:rFonts w:ascii="Arial" w:hAnsi="Arial" w:cs="Arial"/>
-          <w:b/>
-          <w:sz w:val="18"/>
-        </w:rPr>
-        <w:t xml:space="preserve">Global Restaurants (end 2025) — </w:t>
-      </w:r>
-      <w:r>
-        <w:rPr>
-          <w:rFonts w:ascii="Arial" w:hAnsi="Arial" w:cs="Arial"/>
-          <w:b w:val="0"/>
-          <w:sz w:val="18"/>
-        </w:rPr>
-        <w:t>45,356 (+1,879 net new)</w:t>
+        <w:t>Promotion Strategies — McDonald's uses a promotional mix of: Advertising — TV commercials, social media (2.5 million+ Instagram followers in Australia), billboards near schools and shopping centres. Sales Promotion — Monopoly promotion (increases sales 15–20% during campaign), limited-time offers, app-exclusive deals. Public Relations — Ronald McDonald House Charities (RMHC) builds positive brand image. E-Marketing — MyMacca's App with 150 million+ loyalty members globally, personalised offers, mobile ordering.</w:t>
       </w:r>
     </w:p>
     <w:p>
-      <w:pPr>
-        <w:spacing w:before="0" w:after="0" w:line="276" w:lineRule="auto"/>
-        <w:ind w:left="283"/>
-      </w:pPr>
       <w:r>
-        <w:rPr>
-          <w:rFonts w:ascii="Arial" w:hAnsi="Arial" w:cs="Arial"/>
-          <w:b/>
-          <w:sz w:val="18"/>
-        </w:rPr>
-        <w:t xml:space="preserve">Target Restaurants by 2027 — </w:t>
-      </w:r>
-      <w:r>
-        <w:rPr>
-          <w:rFonts w:ascii="Arial" w:hAnsi="Arial" w:cs="Arial"/>
-          <w:b w:val="0"/>
-          <w:sz w:val="18"/>
-        </w:rPr>
-        <w:t>50,000</w:t>
+        <w:t>Place (Distribution) Strategies — McDonald's uses intensive distribution: 40,000+ restaurants in 100+ countries, located near schools, shopping centres, highways, and airports. Channels include dine-in, drive-through (60%+ of Australian sales), McDelivery (partnership with Uber Eats), and self-order kiosks. Over 40 million orders placed daily worldwide.</w:t>
       </w:r>
     </w:p>
     <w:p>
-      <w:pPr>
-        <w:spacing w:before="0" w:after="0" w:line="276" w:lineRule="auto"/>
-        <w:ind w:left="283"/>
-      </w:pPr>
       <w:r>
-        <w:rPr>
-          <w:rFonts w:ascii="Arial" w:hAnsi="Arial" w:cs="Arial"/>
-          <w:b/>
-          <w:sz w:val="18"/>
-        </w:rPr>
-        <w:t xml:space="preserve">Global Market Share (QSR) — </w:t>
-      </w:r>
-      <w:r>
-        <w:rPr>
-          <w:rFonts w:ascii="Arial" w:hAnsi="Arial" w:cs="Arial"/>
-          <w:b w:val="0"/>
-          <w:sz w:val="18"/>
-        </w:rPr>
-        <w:t>#1 globally by revenue and systemwide sales</w:t>
+        <w:t>People Strategies — McDonald's employees are trained through Hamburger University (established 1961, 275,000+ graduates). People are the "face" of the brand — friendly service creates positive customer experience. Franchise owners (93% of restaurants are franchise-operated) are trained to maintain brand standards.</w:t>
       </w:r>
     </w:p>
     <w:p>
-      <w:pPr>
-        <w:spacing w:before="0" w:after="0" w:line="276" w:lineRule="auto"/>
-        <w:ind w:left="283"/>
-      </w:pPr>
       <w:r>
-        <w:rPr>
-          <w:rFonts w:ascii="Arial" w:hAnsi="Arial" w:cs="Arial"/>
-          <w:b/>
-          <w:sz w:val="18"/>
-        </w:rPr>
-        <w:t xml:space="preserve">AU Revenue (2024) — </w:t>
-      </w:r>
-      <w:r>
-        <w:rPr>
-          <w:rFonts w:ascii="Arial" w:hAnsi="Arial" w:cs="Arial"/>
-          <w:b w:val="0"/>
-          <w:sz w:val="18"/>
-        </w:rPr>
-        <w:t>$2.22B AUD</w:t>
+        <w:t>Processes Strategies — McDonald's standardises processes globally: assembly-line food preparation ensures consistency. Self-order kiosks reduce wait times. Mobile ordering via MyMacca's App improves efficiency. Drive-through average service time: 3.5 minutes. These processes improve customer satisfaction and allow McDonald's to serve 69 million customers daily.</w:t>
       </w:r>
     </w:p>
     <w:p>
-      <w:pPr>
-        <w:spacing w:before="0" w:after="0" w:line="276" w:lineRule="auto"/>
-        <w:ind w:left="283"/>
-      </w:pPr>
       <w:r>
-        <w:rPr>
-          <w:rFonts w:ascii="Arial" w:hAnsi="Arial" w:cs="Arial"/>
-          <w:b/>
-          <w:sz w:val="18"/>
-        </w:rPr>
-        <w:t xml:space="preserve">AU Restaurants (end 2024) — </w:t>
-      </w:r>
-      <w:r>
-        <w:rPr>
-          <w:rFonts w:ascii="Arial" w:hAnsi="Arial" w:cs="Arial"/>
-          <w:b w:val="0"/>
-          <w:sz w:val="18"/>
-        </w:rPr>
-        <w:t>1,068</w:t>
-      </w:r>
-    </w:p>
-    <w:p>
-      <w:pPr>
-        <w:spacing w:before="0" w:after="0" w:line="276" w:lineRule="auto"/>
-        <w:ind w:left="283"/>
-      </w:pPr>
-      <w:r>
-        <w:rPr>
-          <w:rFonts w:ascii="Arial" w:hAnsi="Arial" w:cs="Arial"/>
-          <w:b/>
-          <w:sz w:val="18"/>
-        </w:rPr>
-        <w:t xml:space="preserve">AU Restaurants (end 2025) — </w:t>
-      </w:r>
-      <w:r>
-        <w:rPr>
-          <w:rFonts w:ascii="Arial" w:hAnsi="Arial" w:cs="Arial"/>
-          <w:b w:val="0"/>
-          <w:sz w:val="18"/>
-        </w:rPr>
-        <w:t>1,092 (+2.25%)</w:t>
-      </w:r>
-    </w:p>
-    <w:p>
-      <w:pPr>
-        <w:spacing w:before="0" w:after="0" w:line="276" w:lineRule="auto"/>
-        <w:ind w:left="283"/>
-      </w:pPr>
-      <w:r>
-        <w:rPr>
-          <w:rFonts w:ascii="Arial" w:hAnsi="Arial" w:cs="Arial"/>
-          <w:b/>
-          <w:sz w:val="18"/>
-        </w:rPr>
-        <w:t xml:space="preserve">AU Market Share — </w:t>
-      </w:r>
-      <w:r>
-        <w:rPr>
-          <w:rFonts w:ascii="Arial" w:hAnsi="Arial" w:cs="Arial"/>
-          <w:b w:val="0"/>
-          <w:sz w:val="18"/>
-        </w:rPr>
-        <w:t>~23.2% of fast food revenue</w:t>
-      </w:r>
-    </w:p>
-    <w:p>
-      <w:pPr>
-        <w:spacing w:before="0" w:after="0" w:line="276" w:lineRule="auto"/>
-        <w:ind w:left="283"/>
-      </w:pPr>
-      <w:r>
-        <w:rPr>
-          <w:rFonts w:ascii="Arial" w:hAnsi="Arial" w:cs="Arial"/>
-          <w:b/>
-          <w:sz w:val="18"/>
-        </w:rPr>
-        <w:t xml:space="preserve">AU Customers Per Day — </w:t>
-      </w:r>
-      <w:r>
-        <w:rPr>
-          <w:rFonts w:ascii="Arial" w:hAnsi="Arial" w:cs="Arial"/>
-          <w:b w:val="0"/>
-          <w:sz w:val="18"/>
-        </w:rPr>
-        <w:t>1.7 million</w:t>
-      </w:r>
-    </w:p>
-    <w:p>
-      <w:pPr>
-        <w:spacing w:before="0" w:after="0" w:line="276" w:lineRule="auto"/>
-        <w:ind w:left="283"/>
-      </w:pPr>
-      <w:r>
-        <w:rPr>
-          <w:rFonts w:ascii="Arial" w:hAnsi="Arial" w:cs="Arial"/>
-          <w:b/>
-          <w:sz w:val="18"/>
-        </w:rPr>
-        <w:t xml:space="preserve">AU Employees — </w:t>
-      </w:r>
-      <w:r>
-        <w:rPr>
-          <w:rFonts w:ascii="Arial" w:hAnsi="Arial" w:cs="Arial"/>
-          <w:b w:val="0"/>
-          <w:sz w:val="18"/>
-        </w:rPr>
-        <w:t>110,000+</w:t>
-      </w:r>
-    </w:p>
-    <w:p>
-      <w:pPr>
-        <w:spacing w:before="0" w:after="0" w:line="276" w:lineRule="auto"/>
-        <w:ind w:left="283"/>
-      </w:pPr>
-      <w:r>
-        <w:rPr>
-          <w:rFonts w:ascii="Arial" w:hAnsi="Arial" w:cs="Arial"/>
-          <w:b/>
-          <w:sz w:val="18"/>
-        </w:rPr>
-        <w:t xml:space="preserve">Global Employees — </w:t>
-      </w:r>
-      <w:r>
-        <w:rPr>
-          <w:rFonts w:ascii="Arial" w:hAnsi="Arial" w:cs="Arial"/>
-          <w:b w:val="0"/>
-          <w:sz w:val="18"/>
-        </w:rPr>
-        <w:t>2+ million systemwide</w:t>
-      </w:r>
-    </w:p>
-    <w:p>
-      <w:pPr>
-        <w:spacing w:before="0" w:after="0" w:line="276" w:lineRule="auto"/>
-        <w:ind w:left="283"/>
-      </w:pPr>
-      <w:r>
-        <w:rPr>
-          <w:rFonts w:ascii="Arial" w:hAnsi="Arial" w:cs="Arial"/>
-          <w:b/>
-          <w:sz w:val="18"/>
-        </w:rPr>
-        <w:t xml:space="preserve">Customers Per Day (Global) — </w:t>
-      </w:r>
-      <w:r>
-        <w:rPr>
-          <w:rFonts w:ascii="Arial" w:hAnsi="Arial" w:cs="Arial"/>
-          <w:b w:val="0"/>
-          <w:sz w:val="18"/>
-        </w:rPr>
-        <w:t>70+ million</w:t>
-      </w:r>
-    </w:p>
-    <w:p>
-      <w:pPr>
-        <w:spacing w:before="0" w:after="0" w:line="276" w:lineRule="auto"/>
-        <w:ind w:left="283"/>
-      </w:pPr>
-      <w:r>
-        <w:rPr>
-          <w:rFonts w:ascii="Arial" w:hAnsi="Arial" w:cs="Arial"/>
-          <w:b/>
-          <w:sz w:val="18"/>
-        </w:rPr>
-        <w:t xml:space="preserve">Advertising Spend (2024) — </w:t>
-      </w:r>
-      <w:r>
-        <w:rPr>
-          <w:rFonts w:ascii="Arial" w:hAnsi="Arial" w:cs="Arial"/>
-          <w:b w:val="0"/>
-          <w:sz w:val="18"/>
-        </w:rPr>
-        <w:t>~$1.4B USD globally</w:t>
-      </w:r>
-    </w:p>
-    <w:p>
-      <w:pPr>
-        <w:spacing w:before="0" w:after="0" w:line="276" w:lineRule="auto"/>
-        <w:ind w:left="283"/>
-      </w:pPr>
-      <w:r>
-        <w:rPr>
-          <w:rFonts w:ascii="Arial" w:hAnsi="Arial" w:cs="Arial"/>
-          <w:b/>
-          <w:sz w:val="18"/>
-        </w:rPr>
-        <w:t xml:space="preserve">Digital Sales (2025) — </w:t>
-      </w:r>
-      <w:r>
-        <w:rPr>
-          <w:rFonts w:ascii="Arial" w:hAnsi="Arial" w:cs="Arial"/>
-          <w:b w:val="0"/>
-          <w:sz w:val="18"/>
-        </w:rPr>
-        <w:t>$10B+ (20% of system revenue)</w:t>
-      </w:r>
-    </w:p>
-    <w:p>
-      <w:pPr>
-        <w:spacing w:before="0" w:after="0" w:line="276" w:lineRule="auto"/>
-        <w:ind w:left="283"/>
-      </w:pPr>
-      <w:r>
-        <w:rPr>
-          <w:rFonts w:ascii="Arial" w:hAnsi="Arial" w:cs="Arial"/>
-          <w:b/>
-          <w:sz w:val="18"/>
-        </w:rPr>
-        <w:t xml:space="preserve">Digital Revenue Target (2027) — </w:t>
-      </w:r>
-      <w:r>
-        <w:rPr>
-          <w:rFonts w:ascii="Arial" w:hAnsi="Arial" w:cs="Arial"/>
-          <w:b w:val="0"/>
-          <w:sz w:val="18"/>
-        </w:rPr>
-        <w:t>40% of total revenue</w:t>
-      </w:r>
-    </w:p>
-    <w:p>
-      <w:pPr>
-        <w:spacing w:before="0" w:after="0" w:line="276" w:lineRule="auto"/>
-        <w:ind w:left="283"/>
-      </w:pPr>
-      <w:r>
-        <w:rPr>
-          <w:rFonts w:ascii="Arial" w:hAnsi="Arial" w:cs="Arial"/>
-          <w:b/>
-          <w:sz w:val="18"/>
-        </w:rPr>
-        <w:t xml:space="preserve">Loyalty Members (Global) — </w:t>
-      </w:r>
-      <w:r>
-        <w:rPr>
-          <w:rFonts w:ascii="Arial" w:hAnsi="Arial" w:cs="Arial"/>
-          <w:b w:val="0"/>
-          <w:sz w:val="18"/>
-        </w:rPr>
-        <w:t>150M+ active members</w:t>
-      </w:r>
-    </w:p>
-    <w:p>
-      <w:pPr>
-        <w:spacing w:before="0" w:after="0" w:line="276" w:lineRule="auto"/>
-        <w:ind w:left="283"/>
-      </w:pPr>
-      <w:r>
-        <w:rPr>
-          <w:rFonts w:ascii="Arial" w:hAnsi="Arial" w:cs="Arial"/>
-          <w:b/>
-          <w:sz w:val="18"/>
-        </w:rPr>
-        <w:t xml:space="preserve">Loyalty Sales (2025) — </w:t>
-      </w:r>
-      <w:r>
-        <w:rPr>
-          <w:rFonts w:ascii="Arial" w:hAnsi="Arial" w:cs="Arial"/>
-          <w:b w:val="0"/>
-          <w:sz w:val="18"/>
-        </w:rPr>
-        <w:t>$40B systemwide</w:t>
-      </w:r>
-    </w:p>
-    <w:p>
-      <w:pPr>
-        <w:spacing w:before="0" w:after="0" w:line="276" w:lineRule="auto"/>
-        <w:ind w:left="283"/>
-      </w:pPr>
-      <w:r>
-        <w:rPr>
-          <w:rFonts w:ascii="Arial" w:hAnsi="Arial" w:cs="Arial"/>
-          <w:b/>
-          <w:sz w:val="18"/>
-        </w:rPr>
-        <w:t xml:space="preserve">Loyalty Target (2027) — </w:t>
-      </w:r>
-      <w:r>
-        <w:rPr>
-          <w:rFonts w:ascii="Arial" w:hAnsi="Arial" w:cs="Arial"/>
-          <w:b w:val="0"/>
-          <w:sz w:val="18"/>
-        </w:rPr>
-        <w:t>250M active members</w:t>
-      </w:r>
-    </w:p>
-    <w:p>
-      <w:pPr>
-        <w:spacing w:before="0" w:after="0" w:line="276" w:lineRule="auto"/>
-        <w:ind w:left="283"/>
-      </w:pPr>
-      <w:r>
-        <w:rPr>
-          <w:rFonts w:ascii="Arial" w:hAnsi="Arial" w:cs="Arial"/>
-          <w:b/>
-          <w:sz w:val="18"/>
-        </w:rPr>
-        <w:t xml:space="preserve">Drive-Thru % of AU Sales — </w:t>
-      </w:r>
-      <w:r>
-        <w:rPr>
-          <w:rFonts w:ascii="Arial" w:hAnsi="Arial" w:cs="Arial"/>
-          <w:b w:val="0"/>
-          <w:sz w:val="18"/>
-        </w:rPr>
-        <w:t>60-70%</w:t>
-      </w:r>
-    </w:p>
-    <w:p>
-      <w:pPr>
-        <w:spacing w:before="0" w:after="0" w:line="276" w:lineRule="auto"/>
-        <w:ind w:left="283"/>
-      </w:pPr>
-      <w:r>
-        <w:rPr>
-          <w:rFonts w:ascii="Arial" w:hAnsi="Arial" w:cs="Arial"/>
-          <w:b/>
-          <w:sz w:val="18"/>
-        </w:rPr>
-        <w:t xml:space="preserve">Franchise % Globally — </w:t>
-      </w:r>
-      <w:r>
-        <w:rPr>
-          <w:rFonts w:ascii="Arial" w:hAnsi="Arial" w:cs="Arial"/>
-          <w:b w:val="0"/>
-          <w:sz w:val="18"/>
-        </w:rPr>
-        <w:t>~95%</w:t>
-      </w:r>
-    </w:p>
-    <w:p>
-      <w:pPr>
-        <w:spacing w:before="0" w:after="0" w:line="276" w:lineRule="auto"/>
-        <w:ind w:left="283"/>
-      </w:pPr>
-      <w:r>
-        <w:rPr>
-          <w:rFonts w:ascii="Arial" w:hAnsi="Arial" w:cs="Arial"/>
-          <w:b/>
-          <w:sz w:val="18"/>
-        </w:rPr>
-        <w:t xml:space="preserve">Franchise % in AU — </w:t>
-      </w:r>
-      <w:r>
-        <w:rPr>
-          <w:rFonts w:ascii="Arial" w:hAnsi="Arial" w:cs="Arial"/>
-          <w:b w:val="0"/>
-          <w:sz w:val="18"/>
-        </w:rPr>
-        <w:t>80%+</w:t>
-      </w:r>
-    </w:p>
-    <w:p>
-      <w:pPr>
-        <w:spacing w:before="0" w:after="0" w:line="276" w:lineRule="auto"/>
-        <w:ind w:left="283"/>
-      </w:pPr>
-      <w:r>
-        <w:rPr>
-          <w:rFonts w:ascii="Arial" w:hAnsi="Arial" w:cs="Arial"/>
-          <w:b/>
-          <w:sz w:val="18"/>
-        </w:rPr>
-        <w:t xml:space="preserve">Market Capitalisation (2025) — </w:t>
-      </w:r>
-      <w:r>
-        <w:rPr>
-          <w:rFonts w:ascii="Arial" w:hAnsi="Arial" w:cs="Arial"/>
-          <w:b w:val="0"/>
-          <w:sz w:val="18"/>
-        </w:rPr>
-        <w:t>~$215B USD</w:t>
-      </w:r>
-    </w:p>
-    <w:p>
-      <w:pPr>
-        <w:spacing w:before="0" w:after="0" w:line="276" w:lineRule="auto"/>
-        <w:ind w:left="283"/>
-      </w:pPr>
-      <w:r>
-        <w:rPr>
-          <w:rFonts w:ascii="Arial" w:hAnsi="Arial" w:cs="Arial"/>
-          <w:b/>
-          <w:sz w:val="18"/>
-        </w:rPr>
-        <w:t xml:space="preserve">Global Ad Spend (US only) — </w:t>
-      </w:r>
-      <w:r>
-        <w:rPr>
-          <w:rFonts w:ascii="Arial" w:hAnsi="Arial" w:cs="Arial"/>
-          <w:b w:val="0"/>
-          <w:sz w:val="18"/>
-        </w:rPr>
-        <w:t>~$1.1B USD</w:t>
-      </w:r>
-    </w:p>
-    <w:p>
-      <w:pPr>
-        <w:spacing w:before="80" w:after="20" w:line="276" w:lineRule="auto"/>
-      </w:pPr>
-      <w:r>
-        <w:rPr>
-          <w:rFonts w:ascii="Arial" w:hAnsi="Arial" w:cs="Arial"/>
-          <w:b/>
-          <w:sz w:val="20"/>
-        </w:rPr>
-        <w:t>KFC (Yum! Brands)</w:t>
-      </w:r>
-    </w:p>
-    <w:p>
-      <w:pPr>
-        <w:spacing w:before="0" w:after="0" w:line="276" w:lineRule="auto"/>
-        <w:ind w:left="283"/>
-      </w:pPr>
-      <w:r>
-        <w:rPr>
-          <w:rFonts w:ascii="Arial" w:hAnsi="Arial" w:cs="Arial"/>
-          <w:b/>
-          <w:sz w:val="18"/>
-        </w:rPr>
-        <w:t xml:space="preserve">Global Revenue (2024) — </w:t>
-      </w:r>
-      <w:r>
-        <w:rPr>
-          <w:rFonts w:ascii="Arial" w:hAnsi="Arial" w:cs="Arial"/>
-          <w:b w:val="0"/>
-          <w:sz w:val="18"/>
-        </w:rPr>
-        <w:t>~$3.1B USD (Yum! KFC Division)</w:t>
-      </w:r>
-    </w:p>
-    <w:p>
-      <w:pPr>
-        <w:spacing w:before="0" w:after="0" w:line="276" w:lineRule="auto"/>
-        <w:ind w:left="283"/>
-      </w:pPr>
-      <w:r>
-        <w:rPr>
-          <w:rFonts w:ascii="Arial" w:hAnsi="Arial" w:cs="Arial"/>
-          <w:b/>
-          <w:sz w:val="18"/>
-        </w:rPr>
-        <w:t xml:space="preserve">Global Systemwide Sales — </w:t>
-      </w:r>
-      <w:r>
-        <w:rPr>
-          <w:rFonts w:ascii="Arial" w:hAnsi="Arial" w:cs="Arial"/>
-          <w:b w:val="0"/>
-          <w:sz w:val="18"/>
-        </w:rPr>
-        <w:t>~$36B+ USD</w:t>
-      </w:r>
-    </w:p>
-    <w:p>
-      <w:pPr>
-        <w:spacing w:before="0" w:after="0" w:line="276" w:lineRule="auto"/>
-        <w:ind w:left="283"/>
-      </w:pPr>
-      <w:r>
-        <w:rPr>
-          <w:rFonts w:ascii="Arial" w:hAnsi="Arial" w:cs="Arial"/>
-          <w:b/>
-          <w:sz w:val="18"/>
-        </w:rPr>
-        <w:t xml:space="preserve">Global Restaurants (2025) — </w:t>
-      </w:r>
-      <w:r>
-        <w:rPr>
-          <w:rFonts w:ascii="Arial" w:hAnsi="Arial" w:cs="Arial"/>
-          <w:b w:val="0"/>
-          <w:sz w:val="18"/>
-        </w:rPr>
-        <w:t>31,980+ across 150 countries</w:t>
-      </w:r>
-    </w:p>
-    <w:p>
-      <w:pPr>
-        <w:spacing w:before="0" w:after="0" w:line="276" w:lineRule="auto"/>
-        <w:ind w:left="283"/>
-      </w:pPr>
-      <w:r>
-        <w:rPr>
-          <w:rFonts w:ascii="Arial" w:hAnsi="Arial" w:cs="Arial"/>
-          <w:b/>
-          <w:sz w:val="18"/>
-        </w:rPr>
-        <w:t xml:space="preserve">Brand Value (2024) — </w:t>
-      </w:r>
-      <w:r>
-        <w:rPr>
-          <w:rFonts w:ascii="Arial" w:hAnsi="Arial" w:cs="Arial"/>
-          <w:b w:val="0"/>
-          <w:sz w:val="18"/>
-        </w:rPr>
-        <w:t>$12.87B USD</w:t>
-      </w:r>
-    </w:p>
-    <w:p>
-      <w:pPr>
-        <w:spacing w:before="0" w:after="0" w:line="276" w:lineRule="auto"/>
-        <w:ind w:left="283"/>
-      </w:pPr>
-      <w:r>
-        <w:rPr>
-          <w:rFonts w:ascii="Arial" w:hAnsi="Arial" w:cs="Arial"/>
-          <w:b/>
-          <w:sz w:val="18"/>
-        </w:rPr>
-        <w:t xml:space="preserve">AU Locations — </w:t>
-      </w:r>
-      <w:r>
-        <w:rPr>
-          <w:rFonts w:ascii="Arial" w:hAnsi="Arial" w:cs="Arial"/>
-          <w:b w:val="0"/>
-          <w:sz w:val="18"/>
-        </w:rPr>
-        <w:t>700+ (Collins Foods operates 288)</w:t>
-      </w:r>
-    </w:p>
-    <w:p>
-      <w:pPr>
-        <w:spacing w:before="0" w:after="0" w:line="276" w:lineRule="auto"/>
-        <w:ind w:left="283"/>
-      </w:pPr>
-      <w:r>
-        <w:rPr>
-          <w:rFonts w:ascii="Arial" w:hAnsi="Arial" w:cs="Arial"/>
-          <w:b/>
-          <w:sz w:val="18"/>
-        </w:rPr>
-        <w:t xml:space="preserve">AU Market Share — </w:t>
-      </w:r>
-      <w:r>
-        <w:rPr>
-          <w:rFonts w:ascii="Arial" w:hAnsi="Arial" w:cs="Arial"/>
-          <w:b w:val="0"/>
-          <w:sz w:val="18"/>
-        </w:rPr>
-        <w:t>~18%</w:t>
-      </w:r>
-    </w:p>
-    <w:p>
-      <w:pPr>
-        <w:spacing w:before="0" w:after="0" w:line="276" w:lineRule="auto"/>
-        <w:ind w:left="283"/>
-      </w:pPr>
-      <w:r>
-        <w:rPr>
-          <w:rFonts w:ascii="Arial" w:hAnsi="Arial" w:cs="Arial"/>
-          <w:b/>
-          <w:sz w:val="18"/>
-        </w:rPr>
-        <w:t xml:space="preserve">AU Customers Per Week — </w:t>
-      </w:r>
-      <w:r>
-        <w:rPr>
-          <w:rFonts w:ascii="Arial" w:hAnsi="Arial" w:cs="Arial"/>
-          <w:b w:val="0"/>
-          <w:sz w:val="18"/>
-        </w:rPr>
-        <w:t>6.8 million</w:t>
-      </w:r>
-    </w:p>
-    <w:p>
-      <w:pPr>
-        <w:spacing w:before="0" w:after="0" w:line="276" w:lineRule="auto"/>
-        <w:ind w:left="283"/>
-      </w:pPr>
-      <w:r>
-        <w:rPr>
-          <w:rFonts w:ascii="Arial" w:hAnsi="Arial" w:cs="Arial"/>
-          <w:b/>
-          <w:sz w:val="18"/>
-        </w:rPr>
-        <w:t xml:space="preserve">Key Differentiator — </w:t>
-      </w:r>
-      <w:r>
-        <w:rPr>
-          <w:rFonts w:ascii="Arial" w:hAnsi="Arial" w:cs="Arial"/>
-          <w:b w:val="0"/>
-          <w:sz w:val="18"/>
-        </w:rPr>
-        <w:t>Chicken specialist; 'Finger Lickin' Good'</w:t>
-      </w:r>
-    </w:p>
-    <w:p>
-      <w:pPr>
-        <w:spacing w:before="80" w:after="20" w:line="276" w:lineRule="auto"/>
-      </w:pPr>
-      <w:r>
-        <w:rPr>
-          <w:rFonts w:ascii="Arial" w:hAnsi="Arial" w:cs="Arial"/>
-          <w:b/>
-          <w:sz w:val="20"/>
-        </w:rPr>
-        <w:t>Hungry Jack's (Burger King / RBI)</w:t>
-      </w:r>
-    </w:p>
-    <w:p>
-      <w:pPr>
-        <w:spacing w:before="0" w:after="0" w:line="276" w:lineRule="auto"/>
-        <w:ind w:left="283"/>
-      </w:pPr>
-      <w:r>
-        <w:rPr>
-          <w:rFonts w:ascii="Arial" w:hAnsi="Arial" w:cs="Arial"/>
-          <w:b/>
-          <w:sz w:val="18"/>
-        </w:rPr>
-        <w:t xml:space="preserve">Global Systemwide Sales (2024) — </w:t>
-      </w:r>
-      <w:r>
-        <w:rPr>
-          <w:rFonts w:ascii="Arial" w:hAnsi="Arial" w:cs="Arial"/>
-          <w:b w:val="0"/>
-          <w:sz w:val="18"/>
-        </w:rPr>
-        <w:t>~$23B USD (Burger King)</w:t>
-      </w:r>
-    </w:p>
-    <w:p>
-      <w:pPr>
-        <w:spacing w:before="0" w:after="0" w:line="276" w:lineRule="auto"/>
-        <w:ind w:left="283"/>
-      </w:pPr>
-      <w:r>
-        <w:rPr>
-          <w:rFonts w:ascii="Arial" w:hAnsi="Arial" w:cs="Arial"/>
-          <w:b/>
-          <w:sz w:val="18"/>
-        </w:rPr>
-        <w:t xml:space="preserve">Parent Company Revenue (RBI) — </w:t>
-      </w:r>
-      <w:r>
-        <w:rPr>
-          <w:rFonts w:ascii="Arial" w:hAnsi="Arial" w:cs="Arial"/>
-          <w:b w:val="0"/>
-          <w:sz w:val="18"/>
-        </w:rPr>
-        <w:t>~$47B USD (all brands incl. Tim Hortons, Popeyes)</w:t>
-      </w:r>
-    </w:p>
-    <w:p>
-      <w:pPr>
-        <w:spacing w:before="0" w:after="0" w:line="276" w:lineRule="auto"/>
-        <w:ind w:left="283"/>
-      </w:pPr>
-      <w:r>
-        <w:rPr>
-          <w:rFonts w:ascii="Arial" w:hAnsi="Arial" w:cs="Arial"/>
-          <w:b/>
-          <w:sz w:val="18"/>
-        </w:rPr>
-        <w:t xml:space="preserve">Global Restaurants — </w:t>
-      </w:r>
-      <w:r>
-        <w:rPr>
-          <w:rFonts w:ascii="Arial" w:hAnsi="Arial" w:cs="Arial"/>
-          <w:b w:val="0"/>
-          <w:sz w:val="18"/>
-        </w:rPr>
-        <w:t>19,400+ across 120+ countries</w:t>
-      </w:r>
-    </w:p>
-    <w:p>
-      <w:pPr>
-        <w:spacing w:before="0" w:after="0" w:line="276" w:lineRule="auto"/>
-        <w:ind w:left="283"/>
-      </w:pPr>
-      <w:r>
-        <w:rPr>
-          <w:rFonts w:ascii="Arial" w:hAnsi="Arial" w:cs="Arial"/>
-          <w:b/>
-          <w:sz w:val="18"/>
-        </w:rPr>
-        <w:t xml:space="preserve">AU Locations — </w:t>
-      </w:r>
-      <w:r>
-        <w:rPr>
-          <w:rFonts w:ascii="Arial" w:hAnsi="Arial" w:cs="Arial"/>
-          <w:b w:val="0"/>
-          <w:sz w:val="18"/>
-        </w:rPr>
-        <w:t>476</w:t>
-      </w:r>
-    </w:p>
-    <w:p>
-      <w:pPr>
-        <w:spacing w:before="0" w:after="0" w:line="276" w:lineRule="auto"/>
-        <w:ind w:left="283"/>
-      </w:pPr>
-      <w:r>
-        <w:rPr>
-          <w:rFonts w:ascii="Arial" w:hAnsi="Arial" w:cs="Arial"/>
-          <w:b/>
-          <w:sz w:val="18"/>
-        </w:rPr>
-        <w:t xml:space="preserve">AU Revenue (2024) — </w:t>
-      </w:r>
-      <w:r>
-        <w:rPr>
-          <w:rFonts w:ascii="Arial" w:hAnsi="Arial" w:cs="Arial"/>
-          <w:b w:val="0"/>
-          <w:sz w:val="18"/>
-        </w:rPr>
-        <w:t>$2.37B AUD</w:t>
-      </w:r>
-    </w:p>
-    <w:p>
-      <w:pPr>
-        <w:spacing w:before="0" w:after="0" w:line="276" w:lineRule="auto"/>
-        <w:ind w:left="283"/>
-      </w:pPr>
-      <w:r>
-        <w:rPr>
-          <w:rFonts w:ascii="Arial" w:hAnsi="Arial" w:cs="Arial"/>
-          <w:b/>
-          <w:sz w:val="18"/>
-        </w:rPr>
-        <w:t xml:space="preserve">AU Market Share — </w:t>
-      </w:r>
-      <w:r>
-        <w:rPr>
-          <w:rFonts w:ascii="Arial" w:hAnsi="Arial" w:cs="Arial"/>
-          <w:b w:val="0"/>
-          <w:sz w:val="18"/>
-        </w:rPr>
-        <w:t>~12%</w:t>
-      </w:r>
-    </w:p>
-    <w:p>
-      <w:pPr>
-        <w:spacing w:before="0" w:after="0" w:line="276" w:lineRule="auto"/>
-        <w:ind w:left="283"/>
-      </w:pPr>
-      <w:r>
-        <w:rPr>
-          <w:rFonts w:ascii="Arial" w:hAnsi="Arial" w:cs="Arial"/>
-          <w:b/>
-          <w:sz w:val="18"/>
-        </w:rPr>
-        <w:t xml:space="preserve">Key Differentiator — </w:t>
-      </w:r>
-      <w:r>
-        <w:rPr>
-          <w:rFonts w:ascii="Arial" w:hAnsi="Arial" w:cs="Arial"/>
-          <w:b w:val="0"/>
-          <w:sz w:val="18"/>
-        </w:rPr>
-        <w:t>Flame-grilled, not fried; 'Reclaim the Flame' $400M rebrand (2023-24)</w:t>
-      </w:r>
-    </w:p>
-    <w:p>
-      <w:pPr>
-        <w:spacing w:before="80" w:after="20" w:line="276" w:lineRule="auto"/>
-      </w:pPr>
-      <w:r>
-        <w:rPr>
-          <w:rFonts w:ascii="Arial" w:hAnsi="Arial" w:cs="Arial"/>
-          <w:b/>
-          <w:sz w:val="20"/>
-        </w:rPr>
-        <w:t>Subway</w:t>
-      </w:r>
-    </w:p>
-    <w:p>
-      <w:pPr>
-        <w:spacing w:before="0" w:after="0" w:line="276" w:lineRule="auto"/>
-        <w:ind w:left="283"/>
-      </w:pPr>
-      <w:r>
-        <w:rPr>
-          <w:rFonts w:ascii="Arial" w:hAnsi="Arial" w:cs="Arial"/>
-          <w:b/>
-          <w:sz w:val="18"/>
-        </w:rPr>
-        <w:t xml:space="preserve">Global Revenue — </w:t>
-      </w:r>
-      <w:r>
-        <w:rPr>
-          <w:rFonts w:ascii="Arial" w:hAnsi="Arial" w:cs="Arial"/>
-          <w:b w:val="0"/>
-          <w:sz w:val="18"/>
-        </w:rPr>
-        <w:t>Private company (~$10B est.)</w:t>
-      </w:r>
-    </w:p>
-    <w:p>
-      <w:pPr>
-        <w:spacing w:before="0" w:after="0" w:line="276" w:lineRule="auto"/>
-        <w:ind w:left="283"/>
-      </w:pPr>
-      <w:r>
-        <w:rPr>
-          <w:rFonts w:ascii="Arial" w:hAnsi="Arial" w:cs="Arial"/>
-          <w:b/>
-          <w:sz w:val="18"/>
-        </w:rPr>
-        <w:t xml:space="preserve">Global Restaurants (2024) — </w:t>
-      </w:r>
-      <w:r>
-        <w:rPr>
-          <w:rFonts w:ascii="Arial" w:hAnsi="Arial" w:cs="Arial"/>
-          <w:b w:val="0"/>
-          <w:sz w:val="18"/>
-        </w:rPr>
-        <w:t>~37,000 across 100+ countries</w:t>
-      </w:r>
-    </w:p>
-    <w:p>
-      <w:pPr>
-        <w:spacing w:before="0" w:after="0" w:line="276" w:lineRule="auto"/>
-        <w:ind w:left="283"/>
-      </w:pPr>
-      <w:r>
-        <w:rPr>
-          <w:rFonts w:ascii="Arial" w:hAnsi="Arial" w:cs="Arial"/>
-          <w:b/>
-          <w:sz w:val="18"/>
-        </w:rPr>
-        <w:t xml:space="preserve">New Locations Opened (2024) — </w:t>
-      </w:r>
-      <w:r>
-        <w:rPr>
-          <w:rFonts w:ascii="Arial" w:hAnsi="Arial" w:cs="Arial"/>
-          <w:b w:val="0"/>
-          <w:sz w:val="18"/>
-        </w:rPr>
-        <w:t>1,000+ globally (2nd year of net growth)</w:t>
-      </w:r>
-    </w:p>
-    <w:p>
-      <w:pPr>
-        <w:spacing w:before="0" w:after="0" w:line="276" w:lineRule="auto"/>
-        <w:ind w:left="283"/>
-      </w:pPr>
-      <w:r>
-        <w:rPr>
-          <w:rFonts w:ascii="Arial" w:hAnsi="Arial" w:cs="Arial"/>
-          <w:b/>
-          <w:sz w:val="18"/>
-        </w:rPr>
-        <w:t xml:space="preserve">AU Locations — </w:t>
-      </w:r>
-      <w:r>
-        <w:rPr>
-          <w:rFonts w:ascii="Arial" w:hAnsi="Arial" w:cs="Arial"/>
-          <w:b w:val="0"/>
-          <w:sz w:val="18"/>
-        </w:rPr>
-        <w:t>1,200-1,300</w:t>
-      </w:r>
-    </w:p>
-    <w:p>
-      <w:pPr>
-        <w:spacing w:before="0" w:after="0" w:line="276" w:lineRule="auto"/>
-        <w:ind w:left="283"/>
-      </w:pPr>
-      <w:r>
-        <w:rPr>
-          <w:rFonts w:ascii="Arial" w:hAnsi="Arial" w:cs="Arial"/>
-          <w:b/>
-          <w:sz w:val="18"/>
-        </w:rPr>
-        <w:t xml:space="preserve">AU Market Share — </w:t>
-      </w:r>
-      <w:r>
-        <w:rPr>
-          <w:rFonts w:ascii="Arial" w:hAnsi="Arial" w:cs="Arial"/>
-          <w:b w:val="0"/>
-          <w:sz w:val="18"/>
-        </w:rPr>
-        <w:t>~10%</w:t>
-      </w:r>
-    </w:p>
-    <w:p>
-      <w:pPr>
-        <w:spacing w:before="0" w:after="0" w:line="276" w:lineRule="auto"/>
-        <w:ind w:left="283"/>
-      </w:pPr>
-      <w:r>
-        <w:rPr>
-          <w:rFonts w:ascii="Arial" w:hAnsi="Arial" w:cs="Arial"/>
-          <w:b/>
-          <w:sz w:val="18"/>
-        </w:rPr>
-        <w:t xml:space="preserve">Key Differentiator — </w:t>
-      </w:r>
-      <w:r>
-        <w:rPr>
-          <w:rFonts w:ascii="Arial" w:hAnsi="Arial" w:cs="Arial"/>
-          <w:b w:val="0"/>
-          <w:sz w:val="18"/>
-        </w:rPr>
-        <w:t>Health/fresh positioning; 'Eat Fresh'; customisation</w:t>
-      </w:r>
-    </w:p>
-    <w:p>
-      <w:pPr>
-        <w:spacing w:before="80" w:after="20" w:line="276" w:lineRule="auto"/>
-      </w:pPr>
-      <w:r>
-        <w:rPr>
-          <w:rFonts w:ascii="Arial" w:hAnsi="Arial" w:cs="Arial"/>
-          <w:b/>
-          <w:sz w:val="20"/>
-        </w:rPr>
-        <w:t>Wendy's</w:t>
-      </w:r>
-    </w:p>
-    <w:p>
-      <w:pPr>
-        <w:spacing w:before="0" w:after="0" w:line="276" w:lineRule="auto"/>
-        <w:ind w:left="283"/>
-      </w:pPr>
-      <w:r>
-        <w:rPr>
-          <w:rFonts w:ascii="Arial" w:hAnsi="Arial" w:cs="Arial"/>
-          <w:b/>
-          <w:sz w:val="18"/>
-        </w:rPr>
-        <w:t xml:space="preserve">Global Revenue (2024) — </w:t>
-      </w:r>
-      <w:r>
-        <w:rPr>
-          <w:rFonts w:ascii="Arial" w:hAnsi="Arial" w:cs="Arial"/>
-          <w:b w:val="0"/>
-          <w:sz w:val="18"/>
-        </w:rPr>
-        <w:t>$2.1B USD</w:t>
-      </w:r>
-    </w:p>
-    <w:p>
-      <w:pPr>
-        <w:spacing w:before="0" w:after="0" w:line="276" w:lineRule="auto"/>
-        <w:ind w:left="283"/>
-      </w:pPr>
-      <w:r>
-        <w:rPr>
-          <w:rFonts w:ascii="Arial" w:hAnsi="Arial" w:cs="Arial"/>
-          <w:b/>
-          <w:sz w:val="18"/>
-        </w:rPr>
-        <w:t xml:space="preserve">Global Systemwide Sales (2024) — </w:t>
-      </w:r>
-      <w:r>
-        <w:rPr>
-          <w:rFonts w:ascii="Arial" w:hAnsi="Arial" w:cs="Arial"/>
-          <w:b w:val="0"/>
-          <w:sz w:val="18"/>
-        </w:rPr>
-        <w:t>$14.5B USD</w:t>
-      </w:r>
-    </w:p>
-    <w:p>
-      <w:pPr>
-        <w:spacing w:before="0" w:after="0" w:line="276" w:lineRule="auto"/>
-        <w:ind w:left="283"/>
-      </w:pPr>
-      <w:r>
-        <w:rPr>
-          <w:rFonts w:ascii="Arial" w:hAnsi="Arial" w:cs="Arial"/>
-          <w:b/>
-          <w:sz w:val="18"/>
-        </w:rPr>
-        <w:t xml:space="preserve">Global Restaurants (2024) — </w:t>
-      </w:r>
-      <w:r>
-        <w:rPr>
-          <w:rFonts w:ascii="Arial" w:hAnsi="Arial" w:cs="Arial"/>
-          <w:b w:val="0"/>
-          <w:sz w:val="18"/>
-        </w:rPr>
-        <w:t>7,240 (US: 5,933, International: 1,307)</w:t>
-      </w:r>
-    </w:p>
-    <w:p>
-      <w:pPr>
-        <w:spacing w:before="0" w:after="0" w:line="276" w:lineRule="auto"/>
-        <w:ind w:left="283"/>
-      </w:pPr>
-      <w:r>
-        <w:rPr>
-          <w:rFonts w:ascii="Arial" w:hAnsi="Arial" w:cs="Arial"/>
-          <w:b/>
-          <w:sz w:val="18"/>
-        </w:rPr>
-        <w:t xml:space="preserve">AU Locations — </w:t>
-      </w:r>
-      <w:r>
-        <w:rPr>
-          <w:rFonts w:ascii="Arial" w:hAnsi="Arial" w:cs="Arial"/>
-          <w:b w:val="0"/>
-          <w:sz w:val="18"/>
-        </w:rPr>
-        <w:t>1 (opened Jan 2025, Gold Coast)</w:t>
-      </w:r>
-    </w:p>
-    <w:p>
-      <w:pPr>
-        <w:spacing w:before="0" w:after="0" w:line="276" w:lineRule="auto"/>
-        <w:ind w:left="283"/>
-      </w:pPr>
-      <w:r>
-        <w:rPr>
-          <w:rFonts w:ascii="Arial" w:hAnsi="Arial" w:cs="Arial"/>
-          <w:b/>
-          <w:sz w:val="18"/>
-        </w:rPr>
-        <w:t xml:space="preserve">AU Market Share — </w:t>
-      </w:r>
-      <w:r>
-        <w:rPr>
-          <w:rFonts w:ascii="Arial" w:hAnsi="Arial" w:cs="Arial"/>
-          <w:b w:val="0"/>
-          <w:sz w:val="18"/>
-        </w:rPr>
-        <w:t>&lt;1% (new entrant)</w:t>
-      </w:r>
-    </w:p>
-    <w:p>
-      <w:pPr>
-        <w:spacing w:before="0" w:after="0" w:line="276" w:lineRule="auto"/>
-        <w:ind w:left="283"/>
-      </w:pPr>
-      <w:r>
-        <w:rPr>
-          <w:rFonts w:ascii="Arial" w:hAnsi="Arial" w:cs="Arial"/>
-          <w:b/>
-          <w:sz w:val="18"/>
-        </w:rPr>
-        <w:t xml:space="preserve">AU Expansion Plan — </w:t>
-      </w:r>
-      <w:r>
-        <w:rPr>
-          <w:rFonts w:ascii="Arial" w:hAnsi="Arial" w:cs="Arial"/>
-          <w:b w:val="0"/>
-          <w:sz w:val="18"/>
-        </w:rPr>
-        <w:t>200 stores by 2034</w:t>
-      </w:r>
-    </w:p>
-    <w:p>
-      <w:pPr>
-        <w:spacing w:before="0" w:after="0" w:line="276" w:lineRule="auto"/>
-        <w:ind w:left="283"/>
-      </w:pPr>
-      <w:r>
-        <w:rPr>
-          <w:rFonts w:ascii="Arial" w:hAnsi="Arial" w:cs="Arial"/>
-          <w:b/>
-          <w:sz w:val="18"/>
-        </w:rPr>
-        <w:t xml:space="preserve">Key Differentiator — </w:t>
-      </w:r>
-      <w:r>
-        <w:rPr>
-          <w:rFonts w:ascii="Arial" w:hAnsi="Arial" w:cs="Arial"/>
-          <w:b w:val="0"/>
-          <w:sz w:val="18"/>
-        </w:rPr>
-        <w:t>'Fresh, Never Frozen' beef; viral social media</w:t>
-      </w:r>
-    </w:p>
-    <w:p>
-      <w:pPr>
-        <w:spacing w:before="80" w:after="20" w:line="276" w:lineRule="auto"/>
-      </w:pPr>
-      <w:r>
-        <w:rPr>
-          <w:rFonts w:ascii="Arial" w:hAnsi="Arial" w:cs="Arial"/>
-          <w:b/>
-          <w:sz w:val="20"/>
-        </w:rPr>
-        <w:t>Industry Overview</w:t>
-      </w:r>
-    </w:p>
-    <w:p>
-      <w:pPr>
-        <w:spacing w:before="0" w:after="0" w:line="276" w:lineRule="auto"/>
-        <w:ind w:left="283"/>
-      </w:pPr>
-      <w:r>
-        <w:rPr>
-          <w:rFonts w:ascii="Arial" w:hAnsi="Arial" w:cs="Arial"/>
-          <w:b/>
-          <w:sz w:val="18"/>
-        </w:rPr>
-        <w:t xml:space="preserve">Global Fast Food Market (2024) — </w:t>
-      </w:r>
-      <w:r>
-        <w:rPr>
-          <w:rFonts w:ascii="Arial" w:hAnsi="Arial" w:cs="Arial"/>
-          <w:b w:val="0"/>
-          <w:sz w:val="18"/>
-        </w:rPr>
-        <w:t>USD $902.1 billion</w:t>
-      </w:r>
-    </w:p>
-    <w:p>
-      <w:pPr>
-        <w:spacing w:before="0" w:after="0" w:line="276" w:lineRule="auto"/>
-        <w:ind w:left="283"/>
-      </w:pPr>
-      <w:r>
-        <w:rPr>
-          <w:rFonts w:ascii="Arial" w:hAnsi="Arial" w:cs="Arial"/>
-          <w:b/>
-          <w:sz w:val="18"/>
-        </w:rPr>
-        <w:t xml:space="preserve">AU Fast Food Market (2025) — </w:t>
-      </w:r>
-      <w:r>
-        <w:rPr>
-          <w:rFonts w:ascii="Arial" w:hAnsi="Arial" w:cs="Arial"/>
-          <w:b w:val="0"/>
-          <w:sz w:val="18"/>
-        </w:rPr>
-        <w:t>AUD $37.95 billion</w:t>
-      </w:r>
-    </w:p>
-    <w:p>
-      <w:pPr>
-        <w:spacing w:before="0" w:after="0" w:line="276" w:lineRule="auto"/>
-        <w:ind w:left="283"/>
-      </w:pPr>
-      <w:r>
-        <w:rPr>
-          <w:rFonts w:ascii="Arial" w:hAnsi="Arial" w:cs="Arial"/>
-          <w:b/>
-          <w:sz w:val="18"/>
-        </w:rPr>
-        <w:t xml:space="preserve">AU Market Growth Projection — </w:t>
-      </w:r>
-      <w:r>
-        <w:rPr>
-          <w:rFonts w:ascii="Arial" w:hAnsi="Arial" w:cs="Arial"/>
-          <w:b w:val="0"/>
-          <w:sz w:val="18"/>
-        </w:rPr>
-        <w:t>AUD $49.06B by 2035 (2.6% CAGR)</w:t>
-      </w:r>
-    </w:p>
-    <w:p>
-      <w:pPr>
-        <w:spacing w:before="0" w:after="0" w:line="276" w:lineRule="auto"/>
-        <w:ind w:left="283"/>
-      </w:pPr>
-      <w:r>
-        <w:rPr>
-          <w:rFonts w:ascii="Arial" w:hAnsi="Arial" w:cs="Arial"/>
-          <w:b/>
-          <w:sz w:val="18"/>
-        </w:rPr>
-        <w:t xml:space="preserve">QSR Segment Share — </w:t>
-      </w:r>
-      <w:r>
-        <w:rPr>
-          <w:rFonts w:ascii="Arial" w:hAnsi="Arial" w:cs="Arial"/>
-          <w:b w:val="0"/>
-          <w:sz w:val="18"/>
-        </w:rPr>
-        <w:t>53% of total fast food market (2025)</w:t>
-      </w:r>
-    </w:p>
-    <w:p>
-      <w:pPr>
-        <w:spacing w:before="0" w:after="0" w:line="276" w:lineRule="auto"/>
-        <w:ind w:left="283"/>
-      </w:pPr>
-      <w:r>
-        <w:rPr>
-          <w:rFonts w:ascii="Arial" w:hAnsi="Arial" w:cs="Arial"/>
-          <w:b/>
-          <w:sz w:val="18"/>
-        </w:rPr>
-        <w:t xml:space="preserve">AU New Outlets Opened (2024) — </w:t>
-      </w:r>
-      <w:r>
-        <w:rPr>
-          <w:rFonts w:ascii="Arial" w:hAnsi="Arial" w:cs="Arial"/>
-          <w:b w:val="0"/>
-          <w:sz w:val="18"/>
-        </w:rPr>
-        <w:t>178 net new across all brands</w:t>
+        <w:t>Physical Evidence Strategies — Restaurant design: bright lighting, clean tables, visible kitchen areas build trust. Consistent branding (golden arches, red/yellow colour scheme) creates instant recognition. Digital menu boards, McCafé display cases, and Playlands provide physical evidence of quality and family-friendly environment.</w:t>
       </w:r>
     </w:p>
     <w:sectPr>

</xml_diff>

<commit_message>
Stats sheet: dot points only, no paragraphs, exact scaffold format
</commit_message>
<xml_diff>
--- a/Marketing/McDonalds_Marketing_Stats_Sheet.docx
+++ b/Marketing/McDonalds_Marketing_Stats_Sheet.docx
@@ -8,10 +8,9 @@
         <w:jc w:val="center"/>
       </w:pPr>
       <w:r>
-        <w:t>McDonald's Case Study Info</w:t>
+        <w:t>McDonalds Case Study Info</w:t>
       </w:r>
     </w:p>
-    <w:p/>
     <w:p>
       <w:pPr>
         <w:pStyle w:val="Heading2"/>
@@ -21,33 +20,91 @@
       </w:r>
     </w:p>
     <w:p>
+      <w:pPr>
+        <w:pStyle w:val="ListBullet"/>
+      </w:pPr>
       <w:r>
-        <w:t>Consumer Law (CCA 2010) — McDonald's must comply with the Competition and Consumer Act 2010, enforced by the ACCC. This includes no misleading advertising, no bait and switch, implied conditions (fitness for purpose, quality), and mandatory refunds for faulty products. McDonald's Australia revenue $25.9B (2024) shows compliance builds consumer trust and sustains high sales.</w:t>
+        <w:t>CCA 2010 enforced by ACCC — no misleading advertising, implied conditions, mandatory refunds</w:t>
       </w:r>
     </w:p>
     <w:p>
+      <w:pPr>
+        <w:pStyle w:val="ListBullet"/>
+      </w:pPr>
       <w:r>
-        <w:t>Ethical Influences — McDonald's faces ethical scrutiny over health impacts of fast food. The Responsible Children's Marketing Initiative and Quick Service Restaurant Code restrict advertising to children unless products meet nutritional guidelines. This self-regulation protects brand reputation — McDonald's serves 69 million customers daily worldwide, partly because consumers trust the brand acts responsibly.</w:t>
+        <w:t>Quick Service Restaurant Code — restricts children's advertising unless nutritional guidelines met</w:t>
       </w:r>
     </w:p>
     <w:p>
+      <w:pPr>
+        <w:pStyle w:val="ListBullet"/>
+      </w:pPr>
       <w:r>
-        <w:t>Government Influences — Fiscal policy (taxation and government spending) affects consumer disposable income. When interest rates are low, consumers have more spending money and are more likely to eat out. McDonald's adjusts pricing strategies during economic downturns — the Looser Change Menu (items from $1–$3) was introduced to maintain sales when consumers had less disposable income during the GFC.</w:t>
+        <w:t>Responsible Children's Marketing Initiative — self-regulation on kids marketing</w:t>
       </w:r>
     </w:p>
     <w:p>
+      <w:pPr>
+        <w:pStyle w:val="ListBullet"/>
+      </w:pPr>
       <w:r>
-        <w:t>Customer Choice — Psychological: Perception drives choice — McDonald's branding (golden arches, red/yellow colours) creates instant recognition. Motives: convenience and value-for-money appeal to time-poor consumers. Learning: consistent quality leads to repeat purchases and brand loyalty — 150 million+ loyalty members globally show this works.</w:t>
+        <w:t>McDonald's Australia revenue (2024) — $25.9 billion</w:t>
       </w:r>
     </w:p>
     <w:p>
+      <w:pPr>
+        <w:pStyle w:val="ListBullet"/>
+      </w:pPr>
       <w:r>
-        <w:t>Customer Choice — Sociocultural: Family influence — McDonald's Happy Meals target families with children. Culture: menu adapted for local tastes (McSpicy Paneer in India, Teriyaki Burger in Japan). Social class: mass market positioning makes it accessible across all income levels.</w:t>
+        <w:t>McDonald's daily customers worldwide — 69 million</w:t>
       </w:r>
     </w:p>
     <w:p>
+      <w:pPr>
+        <w:pStyle w:val="ListBullet"/>
+      </w:pPr>
       <w:r>
-        <w:t>Customer Choice — Economic: During boom periods, consumers spend more on dining out. During recession, consumers trade down to cheaper options — McDonald's value menu ($1–$3 items) captures price-sensitive customers. RBA interest rate decisions directly affect how much consumers spend on fast food.</w:t>
+        <w:t>Looser Change Menu items ($1–$3) introduced during GFC for price-sensitive consumers</w:t>
+      </w:r>
+    </w:p>
+    <w:p>
+      <w:pPr>
+        <w:pStyle w:val="ListBullet"/>
+      </w:pPr>
+      <w:r>
+        <w:t>RBA cash rate decisions affect consumer disposable income and dining out spend</w:t>
+      </w:r>
+    </w:p>
+    <w:p>
+      <w:pPr>
+        <w:pStyle w:val="ListBullet"/>
+      </w:pPr>
+      <w:r>
+        <w:t>MyMacca's loyalty members globally — 150 million+</w:t>
+      </w:r>
+    </w:p>
+    <w:p>
+      <w:pPr>
+        <w:pStyle w:val="ListBullet"/>
+      </w:pPr>
+      <w:r>
+        <w:t>Happy Meals target families with children</w:t>
+      </w:r>
+    </w:p>
+    <w:p>
+      <w:pPr>
+        <w:pStyle w:val="ListBullet"/>
+      </w:pPr>
+      <w:r>
+        <w:t>Menu adapted by country — McSpicy Paneer (India), Teriyaki Burger (Japan)</w:t>
+      </w:r>
+    </w:p>
+    <w:p>
+      <w:pPr>
+        <w:pStyle w:val="ListBullet"/>
+      </w:pPr>
+      <w:r>
+        <w:t>Mass market positioning — accessible across all income levels</w:t>
       </w:r>
     </w:p>
     <w:p>
@@ -59,33 +116,107 @@
       </w:r>
     </w:p>
     <w:p>
+      <w:pPr>
+        <w:pStyle w:val="ListBullet"/>
+      </w:pPr>
       <w:r>
-        <w:t>Marketing Objectives — McDonald's key objectives: increase market share (23.2% Australian fast food market, 2024), maximise customer service (150 million+ loyalty members), and expand product mix (plant-based options, McCafé range).</w:t>
+        <w:t>Australian fast food market share (2024) — 23.2%</w:t>
       </w:r>
     </w:p>
     <w:p>
+      <w:pPr>
+        <w:pStyle w:val="ListBullet"/>
+      </w:pPr>
       <w:r>
-        <w:t>Market Research — McDonald's uses primary research (customer satisfaction surveys, focus groups on new menu items) and secondary research (industry reports, ABS data). Research identified demand for healthier options → led to salads, grilled chicken, and fruit alternatives. Also identified demand for convenience → led to self-order kiosks and delivery partnerships.</w:t>
+        <w:t>KFC Australian market share (2024) — 16.5%</w:t>
       </w:r>
     </w:p>
     <w:p>
+      <w:pPr>
+        <w:pStyle w:val="ListBullet"/>
+      </w:pPr>
       <w:r>
-        <w:t>SWOT Analysis — Strengths: global brand recognition, 40,000+ restaurants in 100+ countries, $25.9B revenue. Weaknesses: health perceptions, franchise complexity. Opportunities: plant-based market growth, digital ordering expansion. Threats: rising ingredient costs, competition from Hungry Jack's and Subway.</w:t>
+        <w:t>Total menu items — 100+</w:t>
       </w:r>
     </w:p>
     <w:p>
+      <w:pPr>
+        <w:pStyle w:val="ListBullet"/>
+      </w:pPr>
       <w:r>
-        <w:t>Target Market — Primary: families with children (Happy Meals), young adults (value menu). Secondary: health-conscious consumers (salads, grilled options), coffee drinkers (McCafé competing with Starbucks).</w:t>
+        <w:t>Restaurants worldwide — 40,000+</w:t>
       </w:r>
     </w:p>
     <w:p>
+      <w:pPr>
+        <w:pStyle w:val="ListBullet"/>
+      </w:pPr>
       <w:r>
-        <w:t>Product Life Cycle — McDonald's core products (Big Mac, fries) are in the maturity stage — heavy competition, focus on differentiation and loyalty programs. New products like the McPlant are in the growth stage — increasing distribution and promotional spending.</w:t>
+        <w:t>Countries operated in — 100+</w:t>
       </w:r>
     </w:p>
     <w:p>
+      <w:pPr>
+        <w:pStyle w:val="ListBullet"/>
+      </w:pPr>
       <w:r>
-        <w:t>Monitoring &amp; Controlling — McDonald's tracks sales analysis (daily/weekly sales per restaurant), market share analysis (23.2% vs KFC 16.5%), and profitability analysis (menu item margins). Financial forecasts compare projected costs (ingredients, labour, rent) against revenue to allocate resources.</w:t>
+        <w:t>Loyalty members globally — 150 million+</w:t>
+      </w:r>
+    </w:p>
+    <w:p>
+      <w:pPr>
+        <w:pStyle w:val="ListBullet"/>
+      </w:pPr>
+      <w:r>
+        <w:t>Primary research — customer satisfaction surveys, focus groups on new menu items</w:t>
+      </w:r>
+    </w:p>
+    <w:p>
+      <w:pPr>
+        <w:pStyle w:val="ListBullet"/>
+      </w:pPr>
+      <w:r>
+        <w:t>Secondary research — industry reports, ABS data</w:t>
+      </w:r>
+    </w:p>
+    <w:p>
+      <w:pPr>
+        <w:pStyle w:val="ListBullet"/>
+      </w:pPr>
+      <w:r>
+        <w:t>Research led to — salads, grilled chicken, fruit alternatives, self-order kiosks, delivery partnerships</w:t>
+      </w:r>
+    </w:p>
+    <w:p>
+      <w:pPr>
+        <w:pStyle w:val="ListBullet"/>
+      </w:pPr>
+      <w:r>
+        <w:t>Core products (Big Mac, fries) in maturity stage</w:t>
+      </w:r>
+    </w:p>
+    <w:p>
+      <w:pPr>
+        <w:pStyle w:val="ListBullet"/>
+      </w:pPr>
+      <w:r>
+        <w:t>New products (McPlant) in growth stage</w:t>
+      </w:r>
+    </w:p>
+    <w:p>
+      <w:pPr>
+        <w:pStyle w:val="ListBullet"/>
+      </w:pPr>
+      <w:r>
+        <w:t>Menu item margins tracked through profitability analysis</w:t>
+      </w:r>
+    </w:p>
+    <w:p>
+      <w:pPr>
+        <w:pStyle w:val="ListBullet"/>
+      </w:pPr>
+      <w:r>
+        <w:t>Financial forecasts compare projected costs (ingredients, labour, rent) against revenue</w:t>
       </w:r>
     </w:p>
     <w:p>
@@ -97,58 +228,179 @@
       </w:r>
     </w:p>
     <w:p>
+      <w:pPr>
+        <w:pStyle w:val="ListBullet"/>
+      </w:pPr>
       <w:r>
-        <w:t>Product Strategies — McDonald's uses the total product concept: tangible (burger, fries, drink) + intangible (brand reputation, fast service, consistency). Product mix includes 100+ menu items across burgers, chicken, salads, McCafé, desserts, and Happy Meals. Branding: golden arches logo is one of the most recognised globally. Packaging: consistent red/yellow branding across all restaurants.</w:t>
+        <w:t>Product mix — 100+ items (burgers, chicken, salads, McCafe, desserts, Happy Meals)</w:t>
       </w:r>
     </w:p>
     <w:p>
+      <w:pPr>
+        <w:pStyle w:val="ListBullet"/>
+      </w:pPr>
       <w:r>
-        <w:t>Pricing Strategies — McDonald's uses a mix of pricing strategies such as:</w:t>
+        <w:t>Golden arches logo — one of the most recognised globally</w:t>
       </w:r>
     </w:p>
     <w:p>
+      <w:pPr>
+        <w:pStyle w:val="ListBullet"/>
+      </w:pPr>
       <w:r>
-        <w:t>Loss Leaders — Loose Change Menu items ($1–$3): Cheeseburgers, Frozen Cokes, Soft Serve ice creams attract customers who then purchase full-price meals.</w:t>
+        <w:t>Packaging — consistent red/yellow branding across all restaurants</w:t>
       </w:r>
     </w:p>
     <w:p>
+      <w:pPr>
+        <w:pStyle w:val="ListBullet"/>
+      </w:pPr>
       <w:r>
-        <w:t>Price Points — Value meals priced at small ($5.90), medium ($7.90), large ($9.90) — consumers trade up to larger sizes.</w:t>
+        <w:t>Loss Leaders — Cheeseburgers, Frozen Cokes, Soft Serve on Looser Change Menu ($1–$3)</w:t>
       </w:r>
     </w:p>
     <w:p>
+      <w:pPr>
+        <w:pStyle w:val="ListBullet"/>
+      </w:pPr>
       <w:r>
-        <w:t>Prestige Pricing — McCafé coffees priced above takeaway coffee competitors to signal quality ($4.50–$6.50).</w:t>
+        <w:t>Price Points — Value meals small ($5.90), medium ($7.90), large ($9.90)</w:t>
       </w:r>
     </w:p>
     <w:p>
+      <w:pPr>
+        <w:pStyle w:val="ListBullet"/>
+      </w:pPr>
       <w:r>
-        <w:t>Penetration Pricing — McDelivery launched at competitive prices to gain market share in the delivery segment.</w:t>
+        <w:t>Prestige Pricing — McCafe coffees $4.50–$6.50</w:t>
       </w:r>
     </w:p>
     <w:p>
+      <w:pPr>
+        <w:pStyle w:val="ListBullet"/>
+      </w:pPr>
       <w:r>
-        <w:t>Promotion Strategies — McDonald's uses a promotional mix of: Advertising — TV commercials, social media (2.5 million+ Instagram followers in Australia), billboards near schools and shopping centres. Sales Promotion — Monopoly promotion (increases sales 15–20% during campaign), limited-time offers, app-exclusive deals. Public Relations — Ronald McDonald House Charities (RMHC) builds positive brand image. E-Marketing — MyMacca's App with 150 million+ loyalty members globally, personalised offers, mobile ordering.</w:t>
+        <w:t>Penetration Pricing — McDelivery launched at competitive prices</w:t>
       </w:r>
     </w:p>
     <w:p>
+      <w:pPr>
+        <w:pStyle w:val="ListBullet"/>
+      </w:pPr>
       <w:r>
-        <w:t>Place (Distribution) Strategies — McDonald's uses intensive distribution: 40,000+ restaurants in 100+ countries, located near schools, shopping centres, highways, and airports. Channels include dine-in, drive-through (60%+ of Australian sales), McDelivery (partnership with Uber Eats), and self-order kiosks. Over 40 million orders placed daily worldwide.</w:t>
+        <w:t>Instagram followers in Australia — 2.5 million+</w:t>
       </w:r>
     </w:p>
     <w:p>
+      <w:pPr>
+        <w:pStyle w:val="ListBullet"/>
+      </w:pPr>
       <w:r>
-        <w:t>People Strategies — McDonald's employees are trained through Hamburger University (established 1961, 275,000+ graduates). People are the "face" of the brand — friendly service creates positive customer experience. Franchise owners (93% of restaurants are franchise-operated) are trained to maintain brand standards.</w:t>
+        <w:t>Monopoly promotion increases sales — 15–20% during campaign</w:t>
       </w:r>
     </w:p>
     <w:p>
+      <w:pPr>
+        <w:pStyle w:val="ListBullet"/>
+      </w:pPr>
       <w:r>
-        <w:t>Processes Strategies — McDonald's standardises processes globally: assembly-line food preparation ensures consistency. Self-order kiosks reduce wait times. Mobile ordering via MyMacca's App improves efficiency. Drive-through average service time: 3.5 minutes. These processes improve customer satisfaction and allow McDonald's to serve 69 million customers daily.</w:t>
+        <w:t>Ronald McDonald House Charities (RMHC) — positive brand image</w:t>
       </w:r>
     </w:p>
     <w:p>
+      <w:pPr>
+        <w:pStyle w:val="ListBullet"/>
+      </w:pPr>
       <w:r>
-        <w:t>Physical Evidence Strategies — Restaurant design: bright lighting, clean tables, visible kitchen areas build trust. Consistent branding (golden arches, red/yellow colour scheme) creates instant recognition. Digital menu boards, McCafé display cases, and Playlands provide physical evidence of quality and family-friendly environment.</w:t>
+        <w:t>MyMacca's App — personalised offers, mobile ordering, delivery tracking</w:t>
+      </w:r>
+    </w:p>
+    <w:p>
+      <w:pPr>
+        <w:pStyle w:val="ListBullet"/>
+      </w:pPr>
+      <w:r>
+        <w:t>Loyalty members globally — 150 million+</w:t>
+      </w:r>
+    </w:p>
+    <w:p>
+      <w:pPr>
+        <w:pStyle w:val="ListBullet"/>
+      </w:pPr>
+      <w:r>
+        <w:t>Restaurants worldwide — 40,000+</w:t>
+      </w:r>
+    </w:p>
+    <w:p>
+      <w:pPr>
+        <w:pStyle w:val="ListBullet"/>
+      </w:pPr>
+      <w:r>
+        <w:t>Countries operated in — 100+</w:t>
+      </w:r>
+    </w:p>
+    <w:p>
+      <w:pPr>
+        <w:pStyle w:val="ListBullet"/>
+      </w:pPr>
+      <w:r>
+        <w:t>Dine-in, drive-through (60%+ of Australian sales), McDelivery (Uber Eats), self-order kiosks</w:t>
+      </w:r>
+    </w:p>
+    <w:p>
+      <w:pPr>
+        <w:pStyle w:val="ListBullet"/>
+      </w:pPr>
+      <w:r>
+        <w:t>Daily orders worldwide — 40 million+</w:t>
+      </w:r>
+    </w:p>
+    <w:p>
+      <w:pPr>
+        <w:pStyle w:val="ListBullet"/>
+      </w:pPr>
+      <w:r>
+        <w:t>Hamburger University established 1961 — 275,000+ graduates</w:t>
+      </w:r>
+    </w:p>
+    <w:p>
+      <w:pPr>
+        <w:pStyle w:val="ListBullet"/>
+      </w:pPr>
+      <w:r>
+        <w:t>93% of McDonald's restaurants are franchise-operated</w:t>
+      </w:r>
+    </w:p>
+    <w:p>
+      <w:pPr>
+        <w:pStyle w:val="ListBullet"/>
+      </w:pPr>
+      <w:r>
+        <w:t>Drive-through average service time — 3.5 minutes</w:t>
+      </w:r>
+    </w:p>
+    <w:p>
+      <w:pPr>
+        <w:pStyle w:val="ListBullet"/>
+      </w:pPr>
+      <w:r>
+        <w:t>Daily customers worldwide — 69 million</w:t>
+      </w:r>
+    </w:p>
+    <w:p>
+      <w:pPr>
+        <w:pStyle w:val="ListBullet"/>
+      </w:pPr>
+      <w:r>
+        <w:t>Bright lighting, clean tables, visible kitchen areas</w:t>
+      </w:r>
+    </w:p>
+    <w:p>
+      <w:pPr>
+        <w:pStyle w:val="ListBullet"/>
+      </w:pPr>
+      <w:r>
+        <w:t>Digital menu boards, McCafe display cases, Playlands</w:t>
       </w:r>
     </w:p>
     <w:sectPr>

</xml_diff>